<commit_message>
chore: refresh news data
</commit_message>
<xml_diff>
--- a/docs/data/reports/daily-documents/latest/previous_daily_report.docx
+++ b/docs/data/reports/daily-documents/latest/previous_daily_report.docx
@@ -26,7 +26,7 @@
           <w:rFonts w:ascii="Kaiti SC" w:hAnsi="Kaiti SC" w:eastAsia="Kaiti SC" w:cs="Kaiti SC"/>
           <w:sz w:val="21"/>
         </w:rPr>
-        <w:t>2026-07-22（上一自然日）</w:t>
+        <w:t>2026-07-23（上一自然日）</w:t>
       </w:r>
     </w:p>
     <w:tbl>
@@ -81,7 +81,7 @@
                 <w:b w:val="0"/>
                 <w:sz w:val="19"/>
               </w:rPr>
-              <w:t>2026-07-22</w:t>
+              <w:t>2026-07-23</w:t>
             </w:r>
           </w:p>
         </w:tc>
@@ -127,7 +127,7 @@
                 <w:b w:val="0"/>
                 <w:sz w:val="19"/>
               </w:rPr>
-              <w:t>19 条 / 4 家</w:t>
+              <w:t>11 条 / 2 家</w:t>
             </w:r>
           </w:p>
         </w:tc>
@@ -173,7 +173,7 @@
                 <w:b w:val="0"/>
                 <w:sz w:val="19"/>
               </w:rPr>
-              <w:t>12 个</w:t>
+              <w:t>5 个</w:t>
             </w:r>
           </w:p>
         </w:tc>
@@ -219,7 +219,7 @@
                 <w:b w:val="0"/>
                 <w:sz w:val="19"/>
               </w:rPr>
-              <w:t>2026-07-23</w:t>
+              <w:t>2026-07-24</w:t>
             </w:r>
           </w:p>
         </w:tc>
@@ -245,7 +245,7 @@
     </w:p>
     <w:p>
       <w:r>
-        <w:t>2026-07-22 共归档 19 条新闻，覆盖 4 家公司、12 个信息来源。 新闻量较多的公司包括 SpaceX、Blue Origin、微纳星空、蓝箭航天。</w:t>
+        <w:t>2026-07-23 共归档 11 条新闻，覆盖 2 家公司、5 个信息来源。 新闻量较多的公司包括 SpaceX、Blue Origin。</w:t>
       </w:r>
     </w:p>
     <w:p>
@@ -279,7 +279,7 @@
           <w:rFonts w:ascii="Kaiti SC" w:hAnsi="Kaiti SC" w:eastAsia="Kaiti SC" w:cs="Kaiti SC"/>
           <w:sz w:val="21"/>
         </w:rPr>
-        <w:t>【发射与任务】SpaceX：SpaceX launches Northrop mission to extend the life of aging satellites （SpaceNews）</w:t>
+        <w:t>【发射与任务】SpaceX：Florida-launched Starlink satellites now help dog owners find lost pets - Tallahassee Democrat （Tallahassee Democrat）</w:t>
       </w:r>
     </w:p>
     <w:p>
@@ -300,7 +300,7 @@
           <w:rFonts w:ascii="Kaiti SC" w:hAnsi="Kaiti SC" w:eastAsia="Kaiti SC" w:cs="Kaiti SC"/>
           <w:sz w:val="21"/>
         </w:rPr>
-        <w:t>【发射与任务】SpaceX：Falcon 9 to launch MRV-1 robotic servicing spacecraft for Northrop Grumman （NASASpaceflight）</w:t>
+        <w:t>【其他动态】Blue Origin：Did the Blue Origin New Glenn rocket explosion burn this osprey? - Florida Today （Florida Today）</w:t>
       </w:r>
     </w:p>
     <w:p>
@@ -321,7 +321,7 @@
           <w:rFonts w:ascii="Kaiti SC" w:hAnsi="Kaiti SC" w:eastAsia="Kaiti SC" w:cs="Kaiti SC"/>
           <w:sz w:val="21"/>
         </w:rPr>
-        <w:t>【市场与股价】SpaceX：Jamie Dimon Says He Has Seen the Numbers and SpaceX’s Orbital Data Centers ‘Could Actually Work’ Despite Technical, Valuation Risks （bing.com）</w:t>
+        <w:t>【其他动态】SpaceX：SpaceX's Starlink internet could help you track your dogs. Here's how （bing.com）</w:t>
       </w:r>
     </w:p>
     <w:p>
@@ -342,7 +342,7 @@
           <w:rFonts w:ascii="Kaiti SC" w:hAnsi="Kaiti SC" w:eastAsia="Kaiti SC" w:cs="Kaiti SC"/>
           <w:sz w:val="21"/>
         </w:rPr>
-        <w:t>【监管与政策】SpaceX：FCC Scraps Decades-Old Satellite Rules, But SpaceX's Million-Satellite AI Plan Waits in Line - Tech Times （Curated RSS provider contract.）</w:t>
+        <w:t>【其他动态】SpaceX：SpaceX's Starlink internet could help you track your dogs. Here's how （bing.com）</w:t>
       </w:r>
     </w:p>
     <w:p>
@@ -363,7 +363,7 @@
           <w:rFonts w:ascii="Kaiti SC" w:hAnsi="Kaiti SC" w:eastAsia="Kaiti SC" w:cs="Kaiti SC"/>
           <w:sz w:val="21"/>
         </w:rPr>
-        <w:t>【发射与任务】SpaceX：SpaceX Starlink Mini 2 Leak Reinforces Built-In Battery And Portability Upgrade （bing.com）</w:t>
+        <w:t>【发射与任务】SpaceX：SpaceX readies for another attempt at 13th Starship test flight in Texas （bing.com）</w:t>
       </w:r>
     </w:p>
     <w:p>
@@ -384,7 +384,7 @@
           <w:rFonts w:ascii="Kaiti SC" w:hAnsi="Kaiti SC" w:eastAsia="Kaiti SC" w:cs="Kaiti SC"/>
           <w:sz w:val="21"/>
         </w:rPr>
-        <w:t>【发射与任务】Blue Origin：US Space Force Triples NSSL Phase 3 Lane 1 Capacity to $17B as Total Launch Budget Reaches $30B （satnews.com）</w:t>
+        <w:t>【发射与任务】SpaceX：SpaceX readies for another attempt at 13th Starship test flight in Texas （bing.com）</w:t>
       </w:r>
     </w:p>
     <w:p>
@@ -405,28 +405,7 @@
           <w:rFonts w:ascii="Kaiti SC" w:hAnsi="Kaiti SC" w:eastAsia="Kaiti SC" w:cs="Kaiti SC"/>
           <w:sz w:val="21"/>
         </w:rPr>
-        <w:t>【其他动态】蓝箭航天：$金风科技(HK|02208)$ 蓝箭航天马上有消息，要信早信 - 股吧 （股吧）</w:t>
-      </w:r>
-    </w:p>
-    <w:p>
-      <w:pPr>
-        <w:keepLines/>
-        <w:spacing w:after="60"/>
-        <w:ind w:left="369" w:hanging="227"/>
-      </w:pPr>
-      <w:r>
-        <w:rPr>
-          <w:rFonts w:ascii="Kaiti SC" w:hAnsi="Kaiti SC" w:eastAsia="Kaiti SC" w:cs="Kaiti SC"/>
-          <w:sz w:val="21"/>
-        </w:rPr>
-        <w:t xml:space="preserve">➢ </w:t>
-      </w:r>
-      <w:r>
-        <w:rPr>
-          <w:rFonts w:ascii="Kaiti SC" w:hAnsi="Kaiti SC" w:eastAsia="Kaiti SC" w:cs="Kaiti SC"/>
-          <w:sz w:val="21"/>
-        </w:rPr>
-        <w:t>【发射与任务】微纳星空：引力一号遥四运载火箭发射成功，微纳星空“东坡”系列卫星 1.5 小时完成首批遥感影像回传 - 新浪财经 （新浪财经）</w:t>
+        <w:t>【其他动态】Blue Origin：Was this osprey burned by Blue Origin's May 28 New Glenn explosion? - Florida Today （Florida Today）</w:t>
       </w:r>
     </w:p>
     <w:p>
@@ -585,7 +564,7 @@
                 <w:b w:val="0"/>
                 <w:sz w:val="19"/>
               </w:rPr>
-              <w:t>16</w:t>
+              <w:t>9</w:t>
             </w:r>
           </w:p>
         </w:tc>
@@ -606,7 +585,7 @@
                 <w:b w:val="0"/>
                 <w:sz w:val="19"/>
               </w:rPr>
-              <w:t>发射与任务、市场与股价、监管与政策、其他动态</w:t>
+              <w:t>发射与任务、其他动态</w:t>
             </w:r>
           </w:p>
         </w:tc>
@@ -626,7 +605,7 @@
                 <w:b w:val="0"/>
                 <w:sz w:val="19"/>
               </w:rPr>
-              <w:t>SpaceX launches Northrop mission to extend the life of aging satellites</w:t>
+              <w:t>Florida-launched Starlink satellites now help dog owners find lost pets - Tallahassee Democrat</w:t>
             </w:r>
           </w:p>
         </w:tc>
@@ -672,181 +651,7 @@
                 <w:b w:val="0"/>
                 <w:sz w:val="19"/>
               </w:rPr>
-              <w:t>1</w:t>
-            </w:r>
-          </w:p>
-        </w:tc>
-        <w:tc>
-          <w:tcPr>
-            <w:tcW w:type="dxa" w:w="2075"/>
-            <w:vAlign w:val="center"/>
-          </w:tcPr>
-          <w:p>
-            <w:pPr>
-              <w:spacing w:after="0" w:line="252" w:lineRule="auto"/>
-              <w:jc w:val="center"/>
-            </w:pPr>
-            <w:r/>
-            <w:r>
-              <w:rPr>
-                <w:rFonts w:ascii="Kaiti SC" w:hAnsi="Kaiti SC" w:eastAsia="Kaiti SC" w:cs="Kaiti SC"/>
-                <w:b w:val="0"/>
-                <w:sz w:val="19"/>
-              </w:rPr>
-              <w:t>发射与任务</w:t>
-            </w:r>
-          </w:p>
-        </w:tc>
-        <w:tc>
-          <w:tcPr>
-            <w:tcW w:type="dxa" w:w="2075"/>
-            <w:vAlign w:val="center"/>
-          </w:tcPr>
-          <w:p>
-            <w:pPr>
-              <w:spacing w:after="0" w:line="252" w:lineRule="auto"/>
-            </w:pPr>
-            <w:r/>
-            <w:r>
-              <w:rPr>
-                <w:rFonts w:ascii="Kaiti SC" w:hAnsi="Kaiti SC" w:eastAsia="Kaiti SC" w:cs="Kaiti SC"/>
-                <w:b w:val="0"/>
-                <w:sz w:val="19"/>
-              </w:rPr>
-              <w:t>US Space Force Triples NSSL Phase 3 Lane 1 Capacity to $17B as Total Launch Budget Reaches $30B</w:t>
-            </w:r>
-          </w:p>
-        </w:tc>
-      </w:tr>
-      <w:tr>
-        <w:trPr>
-          <w:cantSplit/>
-        </w:trPr>
-        <w:tc>
-          <w:tcPr>
-            <w:tcW w:type="dxa" w:w="2075"/>
-            <w:vAlign w:val="center"/>
-          </w:tcPr>
-          <w:p>
-            <w:pPr>
-              <w:spacing w:after="0" w:line="252" w:lineRule="auto"/>
-            </w:pPr>
-            <w:r/>
-            <w:r>
-              <w:rPr>
-                <w:rFonts w:ascii="Kaiti SC" w:hAnsi="Kaiti SC" w:eastAsia="Kaiti SC" w:cs="Kaiti SC"/>
-                <w:b w:val="0"/>
-                <w:sz w:val="19"/>
-              </w:rPr>
-              <w:t>微纳星空</w:t>
-            </w:r>
-          </w:p>
-        </w:tc>
-        <w:tc>
-          <w:tcPr>
-            <w:tcW w:type="dxa" w:w="2075"/>
-            <w:vAlign w:val="center"/>
-          </w:tcPr>
-          <w:p>
-            <w:pPr>
-              <w:spacing w:after="0" w:line="252" w:lineRule="auto"/>
-              <w:jc w:val="center"/>
-            </w:pPr>
-            <w:r/>
-            <w:r>
-              <w:rPr>
-                <w:rFonts w:ascii="Kaiti SC" w:hAnsi="Kaiti SC" w:eastAsia="Kaiti SC" w:cs="Kaiti SC"/>
-                <w:b w:val="0"/>
-                <w:sz w:val="19"/>
-              </w:rPr>
-              <w:t>1</w:t>
-            </w:r>
-          </w:p>
-        </w:tc>
-        <w:tc>
-          <w:tcPr>
-            <w:tcW w:type="dxa" w:w="2075"/>
-            <w:vAlign w:val="center"/>
-          </w:tcPr>
-          <w:p>
-            <w:pPr>
-              <w:spacing w:after="0" w:line="252" w:lineRule="auto"/>
-              <w:jc w:val="center"/>
-            </w:pPr>
-            <w:r/>
-            <w:r>
-              <w:rPr>
-                <w:rFonts w:ascii="Kaiti SC" w:hAnsi="Kaiti SC" w:eastAsia="Kaiti SC" w:cs="Kaiti SC"/>
-                <w:b w:val="0"/>
-                <w:sz w:val="19"/>
-              </w:rPr>
-              <w:t>发射与任务</w:t>
-            </w:r>
-          </w:p>
-        </w:tc>
-        <w:tc>
-          <w:tcPr>
-            <w:tcW w:type="dxa" w:w="2075"/>
-            <w:vAlign w:val="center"/>
-          </w:tcPr>
-          <w:p>
-            <w:pPr>
-              <w:spacing w:after="0" w:line="252" w:lineRule="auto"/>
-            </w:pPr>
-            <w:r/>
-            <w:r>
-              <w:rPr>
-                <w:rFonts w:ascii="Kaiti SC" w:hAnsi="Kaiti SC" w:eastAsia="Kaiti SC" w:cs="Kaiti SC"/>
-                <w:b w:val="0"/>
-                <w:sz w:val="19"/>
-              </w:rPr>
-              <w:t>引力一号遥四运载火箭发射成功，微纳星空“东坡”系列卫星 1.5 小时完成首批遥感影像回传 - 新浪财经</w:t>
-            </w:r>
-          </w:p>
-        </w:tc>
-      </w:tr>
-      <w:tr>
-        <w:trPr>
-          <w:cantSplit/>
-        </w:trPr>
-        <w:tc>
-          <w:tcPr>
-            <w:tcW w:type="dxa" w:w="2075"/>
-            <w:vAlign w:val="center"/>
-          </w:tcPr>
-          <w:p>
-            <w:pPr>
-              <w:spacing w:after="0" w:line="252" w:lineRule="auto"/>
-            </w:pPr>
-            <w:r/>
-            <w:r>
-              <w:rPr>
-                <w:rFonts w:ascii="Kaiti SC" w:hAnsi="Kaiti SC" w:eastAsia="Kaiti SC" w:cs="Kaiti SC"/>
-                <w:b w:val="0"/>
-                <w:sz w:val="19"/>
-              </w:rPr>
-              <w:t>蓝箭航天</w:t>
-            </w:r>
-          </w:p>
-        </w:tc>
-        <w:tc>
-          <w:tcPr>
-            <w:tcW w:type="dxa" w:w="2075"/>
-            <w:vAlign w:val="center"/>
-          </w:tcPr>
-          <w:p>
-            <w:pPr>
-              <w:spacing w:after="0" w:line="252" w:lineRule="auto"/>
-              <w:jc w:val="center"/>
-            </w:pPr>
-            <w:r/>
-            <w:r>
-              <w:rPr>
-                <w:rFonts w:ascii="Kaiti SC" w:hAnsi="Kaiti SC" w:eastAsia="Kaiti SC" w:cs="Kaiti SC"/>
-                <w:b w:val="0"/>
-                <w:sz w:val="19"/>
-              </w:rPr>
-              <w:t>1</w:t>
+              <w:t>2</w:t>
             </w:r>
           </w:p>
         </w:tc>
@@ -887,7 +692,7 @@
                 <w:b w:val="0"/>
                 <w:sz w:val="19"/>
               </w:rPr>
-              <w:t>$金风科技(HK|02208)$ 蓝箭航天马上有消息，要信早信 - 股吧</w:t>
+              <w:t>Did the Blue Origin New Glenn rocket explosion burn this osprey? - Florida Today</w:t>
             </w:r>
           </w:p>
         </w:tc>
@@ -924,7 +729,7 @@
           <w:rFonts w:ascii="Kaiti SC" w:hAnsi="Kaiti SC" w:eastAsia="Kaiti SC" w:cs="Kaiti SC"/>
           <w:sz w:val="21"/>
         </w:rPr>
-        <w:t>[1] 2026-07-22｜SpaceNews｜SpaceX：SpaceX launches Northrop mission to extend the life of aging satellites</w:t>
+        <w:t>[1] 2026-07-23｜Tallahassee Democrat｜SpaceX：Florida-launched Starlink satellites now help dog owners find lost pets - Tallahassee Democrat</w:t>
       </w:r>
     </w:p>
     <w:p>
@@ -945,7 +750,7 @@
           <w:rFonts w:ascii="Kaiti SC" w:hAnsi="Kaiti SC" w:eastAsia="Kaiti SC" w:cs="Kaiti SC"/>
           <w:sz w:val="21"/>
         </w:rPr>
-        <w:t>[2] 2026-07-22｜NASASpaceflight｜SpaceX：Falcon 9 to launch MRV-1 robotic servicing spacecraft for Northrop Grumman</w:t>
+        <w:t>[2] 2026-07-23｜Florida Today｜Blue Origin：Did the Blue Origin New Glenn rocket explosion burn this osprey? - Florida Today</w:t>
       </w:r>
     </w:p>
     <w:p>
@@ -966,7 +771,7 @@
           <w:rFonts w:ascii="Kaiti SC" w:hAnsi="Kaiti SC" w:eastAsia="Kaiti SC" w:cs="Kaiti SC"/>
           <w:sz w:val="21"/>
         </w:rPr>
-        <w:t>[3] 2026-07-22｜bing.com｜SpaceX：Jamie Dimon Says He Has Seen the Numbers and SpaceX’s Orbital Data Centers ‘Could Actually Work’ Despite Technical, Valuation Risks</w:t>
+        <w:t>[3] 2026-07-23｜bing.com｜SpaceX：SpaceX's Starlink internet could help you track your dogs. Here's how</w:t>
       </w:r>
     </w:p>
     <w:p>
@@ -987,7 +792,7 @@
           <w:rFonts w:ascii="Kaiti SC" w:hAnsi="Kaiti SC" w:eastAsia="Kaiti SC" w:cs="Kaiti SC"/>
           <w:sz w:val="21"/>
         </w:rPr>
-        <w:t>[4] 2026-07-22｜Curated RSS provider contract.｜SpaceX：FCC Scraps Decades-Old Satellite Rules, But SpaceX's Million-Satellite AI Plan Waits in Line - Tech Times</w:t>
+        <w:t>[4] 2026-07-23｜bing.com｜SpaceX：SpaceX's Starlink internet could help you track your dogs. Here's how</w:t>
       </w:r>
     </w:p>
     <w:p>
@@ -1008,7 +813,7 @@
           <w:rFonts w:ascii="Kaiti SC" w:hAnsi="Kaiti SC" w:eastAsia="Kaiti SC" w:cs="Kaiti SC"/>
           <w:sz w:val="21"/>
         </w:rPr>
-        <w:t>[5] 2026-07-22｜bing.com｜SpaceX：SpaceX Starlink Mini 2 Leak Reinforces Built-In Battery And Portability Upgrade</w:t>
+        <w:t>[5] 2026-07-23｜bing.com｜SpaceX：SpaceX readies for another attempt at 13th Starship test flight in Texas</w:t>
       </w:r>
     </w:p>
     <w:p>
@@ -1029,7 +834,7 @@
           <w:rFonts w:ascii="Kaiti SC" w:hAnsi="Kaiti SC" w:eastAsia="Kaiti SC" w:cs="Kaiti SC"/>
           <w:sz w:val="21"/>
         </w:rPr>
-        <w:t>[6] 2026-07-22｜satnews.com｜Blue Origin：US Space Force Triples NSSL Phase 3 Lane 1 Capacity to $17B as Total Launch Budget Reaches $30B</w:t>
+        <w:t>[6] 2026-07-23｜bing.com｜SpaceX：SpaceX readies for another attempt at 13th Starship test flight in Texas</w:t>
       </w:r>
     </w:p>
     <w:p>
@@ -1050,28 +855,7 @@
           <w:rFonts w:ascii="Kaiti SC" w:hAnsi="Kaiti SC" w:eastAsia="Kaiti SC" w:cs="Kaiti SC"/>
           <w:sz w:val="21"/>
         </w:rPr>
-        <w:t>[7] 2026-07-22｜股吧｜蓝箭航天：$金风科技(HK|02208)$ 蓝箭航天马上有消息，要信早信 - 股吧</w:t>
-      </w:r>
-    </w:p>
-    <w:p>
-      <w:pPr>
-        <w:keepLines/>
-        <w:spacing w:after="60"/>
-        <w:ind w:left="369" w:hanging="227"/>
-      </w:pPr>
-      <w:r>
-        <w:rPr>
-          <w:rFonts w:ascii="Kaiti SC" w:hAnsi="Kaiti SC" w:eastAsia="Kaiti SC" w:cs="Kaiti SC"/>
-          <w:sz w:val="21"/>
-        </w:rPr>
-        <w:t xml:space="preserve">✓ </w:t>
-      </w:r>
-      <w:r>
-        <w:rPr>
-          <w:rFonts w:ascii="Kaiti SC" w:hAnsi="Kaiti SC" w:eastAsia="Kaiti SC" w:cs="Kaiti SC"/>
-          <w:sz w:val="21"/>
-        </w:rPr>
-        <w:t>[8] 2026-07-22｜新浪财经｜微纳星空：引力一号遥四运载火箭发射成功，微纳星空“东坡”系列卫星 1.5 小时完成首批遥感影像回传 - 新浪财经</w:t>
+        <w:t>[7] 2026-07-23｜Florida Today｜Blue Origin：Was this osprey burned by Blue Origin's May 28 New Glenn explosion? - Florida Today</w:t>
       </w:r>
     </w:p>
     <w:sectPr>

</xml_diff>